<commit_message>
Update Meeting dates for practical.docx
</commit_message>
<xml_diff>
--- a/Meeting dates for practical.docx
+++ b/Meeting dates for practical.docx
@@ -332,14 +332,7 @@
           <w:sz w:val="28"/>
           <w:szCs w:val="28"/>
         </w:rPr>
-        <w:t xml:space="preserve">dataset </w:t>
-      </w:r>
-      <w:r>
-        <w:rPr>
-          <w:sz w:val="28"/>
-          <w:szCs w:val="28"/>
-        </w:rPr>
-        <w:t xml:space="preserve">cleaning </w:t>
+        <w:t xml:space="preserve">dataset cleaning </w:t>
       </w:r>
       <w:r>
         <w:rPr>
@@ -521,7 +514,6 @@
         </w:rPr>
         <w:t>J</w:t>
       </w:r>
-      <w:proofErr w:type="spellStart"/>
       <w:r>
         <w:rPr>
           <w:sz w:val="28"/>
@@ -529,7 +521,6 @@
         </w:rPr>
         <w:t>une</w:t>
       </w:r>
-      <w:proofErr w:type="spellEnd"/>
       <w:r>
         <w:rPr>
           <w:sz w:val="28"/>
@@ -577,7 +568,6 @@
         </w:rPr>
         <w:t>J</w:t>
       </w:r>
-      <w:proofErr w:type="spellStart"/>
       <w:r>
         <w:rPr>
           <w:sz w:val="28"/>
@@ -585,7 +575,6 @@
         </w:rPr>
         <w:t>une</w:t>
       </w:r>
-      <w:proofErr w:type="spellEnd"/>
       <w:r>
         <w:rPr>
           <w:sz w:val="28"/>
@@ -616,16 +605,7 @@
           <w:szCs w:val="28"/>
           <w:lang w:val="en-GB"/>
         </w:rPr>
-        <w:t>15</w:t>
-      </w:r>
-      <w:proofErr w:type="gramStart"/>
-      <w:r>
-        <w:rPr>
-          <w:sz w:val="28"/>
-          <w:szCs w:val="28"/>
-          <w:lang w:val="en-GB"/>
-        </w:rPr>
-        <w:t>th</w:t>
+        <w:t>15th</w:t>
       </w:r>
       <w:r>
         <w:rPr>
@@ -642,16 +622,7 @@
           <w:szCs w:val="28"/>
           <w:lang w:val="en-GB"/>
         </w:rPr>
-        <w:t>June</w:t>
-      </w:r>
-      <w:proofErr w:type="gramEnd"/>
-      <w:r>
-        <w:rPr>
-          <w:sz w:val="28"/>
-          <w:szCs w:val="28"/>
-          <w:lang w:val="en-GB"/>
-        </w:rPr>
-        <w:t xml:space="preserve"> – Solving the errors in the code</w:t>
+        <w:t>June – Solving the errors in the code</w:t>
       </w:r>
     </w:p>
     <w:p>
@@ -670,6 +641,106 @@
         </w:rPr>
         <w:t>19th June – Working on the presentation and Training the Model</w:t>
       </w:r>
+    </w:p>
+    <w:p>
+      <w:pPr>
+        <w:rPr>
+          <w:sz w:val="28"/>
+          <w:szCs w:val="28"/>
+          <w:lang w:val="en-DE"/>
+        </w:rPr>
+      </w:pPr>
+      <w:r>
+        <w:rPr>
+          <w:sz w:val="28"/>
+          <w:szCs w:val="28"/>
+          <w:lang w:val="en-GB"/>
+        </w:rPr>
+        <w:t xml:space="preserve">23rd June – completed second presentation </w:t>
+      </w:r>
+    </w:p>
+    <w:p>
+      <w:pPr>
+        <w:rPr>
+          <w:sz w:val="28"/>
+          <w:szCs w:val="28"/>
+          <w:lang w:val="en-DE"/>
+        </w:rPr>
+      </w:pPr>
+      <w:r>
+        <w:rPr>
+          <w:sz w:val="28"/>
+          <w:szCs w:val="28"/>
+          <w:lang w:val="en-GB"/>
+        </w:rPr>
+        <w:t>1st July – Started Initial testing and evaluation</w:t>
+      </w:r>
+    </w:p>
+    <w:p>
+      <w:pPr>
+        <w:rPr>
+          <w:sz w:val="28"/>
+          <w:szCs w:val="28"/>
+          <w:lang w:val="en-DE"/>
+        </w:rPr>
+      </w:pPr>
+      <w:r>
+        <w:rPr>
+          <w:sz w:val="28"/>
+          <w:szCs w:val="28"/>
+          <w:lang w:val="en-GB"/>
+        </w:rPr>
+        <w:t xml:space="preserve">8th July – Fine Tuning and Report editing </w:t>
+      </w:r>
+    </w:p>
+    <w:p>
+      <w:pPr>
+        <w:rPr>
+          <w:sz w:val="28"/>
+          <w:szCs w:val="28"/>
+          <w:lang w:val="en-DE"/>
+        </w:rPr>
+      </w:pPr>
+      <w:r>
+        <w:rPr>
+          <w:sz w:val="28"/>
+          <w:szCs w:val="28"/>
+          <w:lang w:val="en-GB"/>
+        </w:rPr>
+        <w:t xml:space="preserve">12th July - </w:t>
+      </w:r>
+      <w:r>
+        <w:rPr>
+          <w:sz w:val="28"/>
+          <w:szCs w:val="28"/>
+        </w:rPr>
+        <w:t>verify documentation and preparing the PPT</w:t>
+      </w:r>
+    </w:p>
+    <w:p>
+      <w:pPr>
+        <w:rPr>
+          <w:sz w:val="28"/>
+          <w:szCs w:val="28"/>
+          <w:lang w:val="en-DE"/>
+        </w:rPr>
+      </w:pPr>
+      <w:r>
+        <w:rPr>
+          <w:sz w:val="28"/>
+          <w:szCs w:val="28"/>
+        </w:rPr>
+        <w:t xml:space="preserve">14th July – final editing </w:t>
+      </w:r>
+    </w:p>
+    <w:p>
+      <w:pPr>
+        <w:rPr>
+          <w:sz w:val="28"/>
+          <w:szCs w:val="28"/>
+          <w:lang w:val="en-GB"/>
+        </w:rPr>
+      </w:pPr>
     </w:p>
     <w:p>
       <w:pPr>
@@ -688,6 +759,154 @@
     </w:sectPr>
   </w:body>
 </w:document>
+</file>
+
+<file path=word/numbering.xml><?xml version="1.0" encoding="utf-8"?>
+<w:numbering xmlns:wpc="http://schemas.microsoft.com/office/word/2010/wordprocessingCanvas" xmlns:cx="http://schemas.microsoft.com/office/drawing/2014/chartex" xmlns:cx1="http://schemas.microsoft.com/office/drawing/2015/9/8/chartex" xmlns:cx2="http://schemas.microsoft.com/office/drawing/2015/10/21/chartex" xmlns:cx3="http://schemas.microsoft.com/office/drawing/2016/5/9/chartex" xmlns:cx4="http://schemas.microsoft.com/office/drawing/2016/5/10/chartex" xmlns:cx5="http://schemas.microsoft.com/office/drawing/2016/5/11/chartex" xmlns:cx6="http://schemas.microsoft.com/office/drawing/2016/5/12/chartex" xmlns:cx7="http://schemas.microsoft.com/office/drawing/2016/5/13/chartex" xmlns:cx8="http://schemas.microsoft.com/office/drawing/2016/5/14/chartex" xmlns:mc="http://schemas.openxmlformats.org/markup-compatibility/2006" xmlns:aink="http://schemas.microsoft.com/office/drawing/2016/ink" xmlns:am3d="http://schemas.microsoft.com/office/drawing/2017/model3d" xmlns:o="urn:schemas-microsoft-com:office:office" xmlns:oel="http://schemas.microsoft.com/office/2019/extlst" xmlns:r="http://schemas.openxmlformats.org/officeDocument/2006/relationships" xmlns:m="http://schemas.openxmlformats.org/officeDocument/2006/math" xmlns:v="urn:schemas-microsoft-com:vml" xmlns:wp14="http://schemas.microsoft.com/office/word/2010/wordprocessingDrawing" xmlns:wp="http://schemas.openxmlformats.org/drawingml/2006/wordprocessingDrawing" xmlns:w10="urn:schemas-microsoft-com:office:word" xmlns:w="http://schemas.openxmlformats.org/wordprocessingml/2006/main" xmlns:w14="http://schemas.microsoft.com/office/word/2010/wordml" xmlns:w15="http://schemas.microsoft.com/office/word/2012/wordml" xmlns:w16cex="http://schemas.microsoft.com/office/word/2018/wordml/cex" xmlns:w16cid="http://schemas.microsoft.com/office/word/2016/wordml/cid" xmlns:w16="http://schemas.microsoft.com/office/word/2018/wordml" xmlns:w16du="http://schemas.microsoft.com/office/word/2023/wordml/word16du" xmlns:w16sdtdh="http://schemas.microsoft.com/office/word/2020/wordml/sdtdatahash" xmlns:w16sdtfl="http://schemas.microsoft.com/office/word/2024/wordml/sdtformatlock" xmlns:w16se="http://schemas.microsoft.com/office/word/2015/wordml/symex" xmlns:wpg="http://schemas.microsoft.com/office/word/2010/wordprocessingGroup" xmlns:wpi="http://schemas.microsoft.com/office/word/2010/wordprocessingInk" xmlns:wne="http://schemas.microsoft.com/office/word/2006/wordml" xmlns:wps="http://schemas.microsoft.com/office/word/2010/wordprocessingShape" mc:Ignorable="w14 w15 w16se w16cid w16 w16cex w16sdtdh w16sdtfl w16du wp14">
+  <w:abstractNum w:abstractNumId="0" w15:restartNumberingAfterBreak="0">
+    <w:nsid w:val="6D6B6C07"/>
+    <w:multiLevelType w:val="hybridMultilevel"/>
+    <w:tmpl w:val="5372D6AE"/>
+    <w:lvl w:ilvl="0" w:tplc="5916137E">
+      <w:start w:val="1"/>
+      <w:numFmt w:val="bullet"/>
+      <w:lvlText w:val=""/>
+      <w:lvlJc w:val="left"/>
+      <w:pPr>
+        <w:tabs>
+          <w:tab w:val="num" w:pos="720"/>
+        </w:tabs>
+        <w:ind w:left="720" w:hanging="360"/>
+      </w:pPr>
+      <w:rPr>
+        <w:rFonts w:ascii="Wingdings" w:hAnsi="Wingdings" w:hint="default"/>
+      </w:rPr>
+    </w:lvl>
+    <w:lvl w:ilvl="1" w:tplc="42E6EDAC" w:tentative="1">
+      <w:start w:val="1"/>
+      <w:numFmt w:val="bullet"/>
+      <w:lvlText w:val=""/>
+      <w:lvlJc w:val="left"/>
+      <w:pPr>
+        <w:tabs>
+          <w:tab w:val="num" w:pos="1440"/>
+        </w:tabs>
+        <w:ind w:left="1440" w:hanging="360"/>
+      </w:pPr>
+      <w:rPr>
+        <w:rFonts w:ascii="Wingdings" w:hAnsi="Wingdings" w:hint="default"/>
+      </w:rPr>
+    </w:lvl>
+    <w:lvl w:ilvl="2" w:tplc="A8FEA8A6" w:tentative="1">
+      <w:start w:val="1"/>
+      <w:numFmt w:val="bullet"/>
+      <w:lvlText w:val=""/>
+      <w:lvlJc w:val="left"/>
+      <w:pPr>
+        <w:tabs>
+          <w:tab w:val="num" w:pos="2160"/>
+        </w:tabs>
+        <w:ind w:left="2160" w:hanging="360"/>
+      </w:pPr>
+      <w:rPr>
+        <w:rFonts w:ascii="Wingdings" w:hAnsi="Wingdings" w:hint="default"/>
+      </w:rPr>
+    </w:lvl>
+    <w:lvl w:ilvl="3" w:tplc="8812B8F8" w:tentative="1">
+      <w:start w:val="1"/>
+      <w:numFmt w:val="bullet"/>
+      <w:lvlText w:val=""/>
+      <w:lvlJc w:val="left"/>
+      <w:pPr>
+        <w:tabs>
+          <w:tab w:val="num" w:pos="2880"/>
+        </w:tabs>
+        <w:ind w:left="2880" w:hanging="360"/>
+      </w:pPr>
+      <w:rPr>
+        <w:rFonts w:ascii="Wingdings" w:hAnsi="Wingdings" w:hint="default"/>
+      </w:rPr>
+    </w:lvl>
+    <w:lvl w:ilvl="4" w:tplc="75E43136" w:tentative="1">
+      <w:start w:val="1"/>
+      <w:numFmt w:val="bullet"/>
+      <w:lvlText w:val=""/>
+      <w:lvlJc w:val="left"/>
+      <w:pPr>
+        <w:tabs>
+          <w:tab w:val="num" w:pos="3600"/>
+        </w:tabs>
+        <w:ind w:left="3600" w:hanging="360"/>
+      </w:pPr>
+      <w:rPr>
+        <w:rFonts w:ascii="Wingdings" w:hAnsi="Wingdings" w:hint="default"/>
+      </w:rPr>
+    </w:lvl>
+    <w:lvl w:ilvl="5" w:tplc="68EA583E" w:tentative="1">
+      <w:start w:val="1"/>
+      <w:numFmt w:val="bullet"/>
+      <w:lvlText w:val=""/>
+      <w:lvlJc w:val="left"/>
+      <w:pPr>
+        <w:tabs>
+          <w:tab w:val="num" w:pos="4320"/>
+        </w:tabs>
+        <w:ind w:left="4320" w:hanging="360"/>
+      </w:pPr>
+      <w:rPr>
+        <w:rFonts w:ascii="Wingdings" w:hAnsi="Wingdings" w:hint="default"/>
+      </w:rPr>
+    </w:lvl>
+    <w:lvl w:ilvl="6" w:tplc="A7141BE0" w:tentative="1">
+      <w:start w:val="1"/>
+      <w:numFmt w:val="bullet"/>
+      <w:lvlText w:val=""/>
+      <w:lvlJc w:val="left"/>
+      <w:pPr>
+        <w:tabs>
+          <w:tab w:val="num" w:pos="5040"/>
+        </w:tabs>
+        <w:ind w:left="5040" w:hanging="360"/>
+      </w:pPr>
+      <w:rPr>
+        <w:rFonts w:ascii="Wingdings" w:hAnsi="Wingdings" w:hint="default"/>
+      </w:rPr>
+    </w:lvl>
+    <w:lvl w:ilvl="7" w:tplc="B3B486F6" w:tentative="1">
+      <w:start w:val="1"/>
+      <w:numFmt w:val="bullet"/>
+      <w:lvlText w:val=""/>
+      <w:lvlJc w:val="left"/>
+      <w:pPr>
+        <w:tabs>
+          <w:tab w:val="num" w:pos="5760"/>
+        </w:tabs>
+        <w:ind w:left="5760" w:hanging="360"/>
+      </w:pPr>
+      <w:rPr>
+        <w:rFonts w:ascii="Wingdings" w:hAnsi="Wingdings" w:hint="default"/>
+      </w:rPr>
+    </w:lvl>
+    <w:lvl w:ilvl="8" w:tplc="32F0A87E" w:tentative="1">
+      <w:start w:val="1"/>
+      <w:numFmt w:val="bullet"/>
+      <w:lvlText w:val=""/>
+      <w:lvlJc w:val="left"/>
+      <w:pPr>
+        <w:tabs>
+          <w:tab w:val="num" w:pos="6480"/>
+        </w:tabs>
+        <w:ind w:left="6480" w:hanging="360"/>
+      </w:pPr>
+      <w:rPr>
+        <w:rFonts w:ascii="Wingdings" w:hAnsi="Wingdings" w:hint="default"/>
+      </w:rPr>
+    </w:lvl>
+  </w:abstractNum>
+  <w:num w:numId="1" w16cid:durableId="785540419">
+    <w:abstractNumId w:val="0"/>
+  </w:num>
+</w:numbering>
 </file>
 
 <file path=word/styles.xml><?xml version="1.0" encoding="utf-8"?>

</xml_diff>